<commit_message>
Final edits to research paper
</commit_message>
<xml_diff>
--- a/final_report.docx
+++ b/final_report.docx
@@ -111,7 +111,7 @@
         <w:pStyle w:val="TitlePage"/>
       </w:pPr>
       <w:r>
-        <w:t xml:space="preserve"> </w:t>
+        <w:t xml:space="preserve">Submitted by:</w:t>
       </w:r>
     </w:p>
     <w:p>
@@ -119,7 +119,7 @@
         <w:pStyle w:val="TitlePage"/>
       </w:pPr>
       <w:r>
-        <w:t xml:space="preserve">Submitted by:</w:t>
+        <w:t xml:space="preserve">Manan Patel, Richard Park, Michael Phillips</w:t>
       </w:r>
     </w:p>
     <w:p>
@@ -127,7 +127,7 @@
         <w:pStyle w:val="TitlePage"/>
       </w:pPr>
       <w:r>
-        <w:t xml:space="preserve">Manan Patel, Richard Park, Michael Phillips</w:t>
+        <w:t xml:space="preserve">Group 6</w:t>
       </w:r>
     </w:p>
     <w:p>
@@ -135,7 +135,7 @@
         <w:pStyle w:val="TitlePage"/>
       </w:pPr>
       <w:r>
-        <w:t xml:space="preserve">Group 6</w:t>
+        <w:t xml:space="preserve">October 11, 2026</w:t>
       </w:r>
     </w:p>
     <w:p>
@@ -143,7 +143,15 @@
         <w:pStyle w:val="TitlePage"/>
       </w:pPr>
       <w:r>
-        <w:t xml:space="preserve">October 11, 2026</w:t>
+        <w:t xml:space="preserve">Repository Link:</w:t>
+      </w:r>
+    </w:p>
+    <w:p>
+      <w:pPr>
+        <w:pStyle w:val="TitlePage"/>
+      </w:pPr>
+      <w:r>
+        <w:t xml:space="preserve">https://github.com/mpp66-ctrl/ad688-industry-career-product-group6.git</w:t>
       </w:r>
     </w:p>
     <w:p>
@@ -1510,7 +1518,7 @@
       </w:r>
     </w:p>
     <w:bookmarkEnd w:id="21"/>
-    <w:bookmarkStart w:id="25" w:name="market-baseline"/>
+    <w:bookmarkStart w:id="31" w:name="market-baseline"/>
     <w:p>
       <w:pPr>
         <w:pStyle w:val="Heading1"/>
@@ -1827,7 +1835,7 @@
               <w:t xml:space="preserve"> </w:t>
             </w:r>
             <w:r>
-              <w:t xml:space="preserve">pay.</w:t>
+              <w:t xml:space="preserve">pay (Figure 2).</w:t>
             </w:r>
           </w:p>
         </w:tc>
@@ -1913,7 +1921,13 @@
               <w:spacing w:before="30" w:after="50" w:line="240" w:lineRule="auto"/>
             </w:pPr>
             <w:r>
-              <w:t xml:space="preserve">Few postings describe a new graduate.</w:t>
+              <w:t xml:space="preserve">Few postings describe a new graduate</w:t>
+            </w:r>
+            <w:r>
+              <w:t xml:space="preserve"> </w:t>
+            </w:r>
+            <w:r>
+              <w:t xml:space="preserve">(Figure 3).</w:t>
             </w:r>
           </w:p>
         </w:tc>
@@ -2150,8 +2164,152 @@
         <w:t xml:space="preserve">($120,230) based off the U.S. Bureau of Labor Statistics in 2026, partly because salary disclosure is concentrated in high-pay states.</w:t>
       </w:r>
     </w:p>
-    <w:bookmarkEnd w:id="25"/>
-    <w:bookmarkStart w:id="32" w:name="skill-gap-analysis"/>
+    <w:p>
+      <w:pPr>
+        <w:pStyle w:val="ImageCentered"/>
+      </w:pPr>
+      <w:r>
+        <w:drawing>
+          <wp:inline>
+            <wp:extent cx="5943600" cy="3238500"/>
+            <wp:effectExtent b="0" l="0" r="0" t="0"/>
+            <wp:docPr descr="" title="" id="26" name="Picture"/>
+            <a:graphic>
+              <a:graphicData uri="http://schemas.openxmlformats.org/drawingml/2006/picture">
+                <pic:pic>
+                  <pic:nvPicPr>
+                    <pic:cNvPr descr="report_media/media/image7.png" id="27" name="Picture"/>
+                    <pic:cNvPicPr>
+                      <a:picLocks noChangeArrowheads="1" noChangeAspect="1"/>
+                    </pic:cNvPicPr>
+                  </pic:nvPicPr>
+                  <pic:blipFill>
+                    <a:blip r:embed="rId25"/>
+                    <a:stretch>
+                      <a:fillRect/>
+                    </a:stretch>
+                  </pic:blipFill>
+                  <pic:spPr bwMode="auto">
+                    <a:xfrm>
+                      <a:off x="0" y="0"/>
+                      <a:ext cx="5943600" cy="3238500"/>
+                    </a:xfrm>
+                    <a:prstGeom prst="rect">
+                      <a:avLst/>
+                    </a:prstGeom>
+                    <a:noFill/>
+                    <a:ln w="9525">
+                      <a:noFill/>
+                      <a:headEnd/>
+                      <a:tailEnd/>
+                    </a:ln>
+                  </pic:spPr>
+                </pic:pic>
+              </a:graphicData>
+            </a:graphic>
+          </wp:inline>
+        </w:drawing>
+      </w:r>
+    </w:p>
+    <w:p>
+      <w:pPr>
+        <w:pStyle w:val="CaptionCentered"/>
+      </w:pPr>
+      <w:r>
+        <w:t xml:space="preserve">Figure 2: Top 10 states by number of postings (653 postings with a U.S. state)</w:t>
+      </w:r>
+    </w:p>
+    <w:p>
+      <w:pPr>
+        <w:pStyle w:val="BodyText"/>
+      </w:pPr>
+      <w:r>
+        <w:t xml:space="preserve">Figure 2 shows that demand is concentrated in a few states. California and New York hold 39% of postings with a known state. Virginia,</w:t>
+      </w:r>
+      <w:r>
+        <w:t xml:space="preserve"> </w:t>
+      </w:r>
+      <w:r>
+        <w:t xml:space="preserve">the District of Columbia, and Maryland together hold 96 postings, more than any single state except California and New York. These are</w:t>
+      </w:r>
+      <w:r>
+        <w:t xml:space="preserve"> </w:t>
+      </w:r>
+      <w:r>
+        <w:t xml:space="preserve">largely federal-contractor roles, and Virginia pay runs about $24,000 below an average posting (Figure 6).</w:t>
+      </w:r>
+    </w:p>
+    <w:p>
+      <w:pPr>
+        <w:pStyle w:val="ImageCentered"/>
+      </w:pPr>
+      <w:r>
+        <w:drawing>
+          <wp:inline>
+            <wp:extent cx="5943600" cy="2921000"/>
+            <wp:effectExtent b="0" l="0" r="0" t="0"/>
+            <wp:docPr descr="" title="" id="29" name="Picture"/>
+            <a:graphic>
+              <a:graphicData uri="http://schemas.openxmlformats.org/drawingml/2006/picture">
+                <pic:pic>
+                  <pic:nvPicPr>
+                    <pic:cNvPr descr="report_media/media/image8.png" id="30" name="Picture"/>
+                    <pic:cNvPicPr>
+                      <a:picLocks noChangeArrowheads="1" noChangeAspect="1"/>
+                    </pic:cNvPicPr>
+                  </pic:nvPicPr>
+                  <pic:blipFill>
+                    <a:blip r:embed="rId28"/>
+                    <a:stretch>
+                      <a:fillRect/>
+                    </a:stretch>
+                  </pic:blipFill>
+                  <pic:spPr bwMode="auto">
+                    <a:xfrm>
+                      <a:off x="0" y="0"/>
+                      <a:ext cx="5943600" cy="2921000"/>
+                    </a:xfrm>
+                    <a:prstGeom prst="rect">
+                      <a:avLst/>
+                    </a:prstGeom>
+                    <a:noFill/>
+                    <a:ln w="9525">
+                      <a:noFill/>
+                      <a:headEnd/>
+                      <a:tailEnd/>
+                    </a:ln>
+                  </pic:spPr>
+                </pic:pic>
+              </a:graphicData>
+            </a:graphic>
+          </wp:inline>
+        </w:drawing>
+      </w:r>
+    </w:p>
+    <w:p>
+      <w:pPr>
+        <w:pStyle w:val="CaptionCentered"/>
+      </w:pPr>
+      <w:r>
+        <w:t xml:space="preserve">Figure 3: Minimum years of experience requested (206 postings that state a requirement)</w:t>
+      </w:r>
+    </w:p>
+    <w:p>
+      <w:pPr>
+        <w:pStyle w:val="BodyText"/>
+      </w:pPr>
+      <w:r>
+        <w:t xml:space="preserve">Figure 3 shows that requirements peak at five years, and only 36 of the 206 postings ask for two years or fewer. A new graduate will</w:t>
+      </w:r>
+      <w:r>
+        <w:t xml:space="preserve"> </w:t>
+      </w:r>
+      <w:r>
+        <w:t xml:space="preserve">usually fall below the stated requirement, which is the reason for Recommendation 4.</w:t>
+      </w:r>
+    </w:p>
+    <w:bookmarkEnd w:id="31"/>
+    <w:bookmarkStart w:id="38" w:name="skill-gap-analysis"/>
     <w:p>
       <w:pPr>
         <w:pStyle w:val="Heading1"/>
@@ -2238,18 +2396,18 @@
           <wp:inline>
             <wp:extent cx="5943600" cy="4762500"/>
             <wp:effectExtent b="0" l="0" r="0" t="0"/>
-            <wp:docPr descr="" title="" id="27" name="Picture"/>
+            <wp:docPr descr="" title="" id="33" name="Picture"/>
             <a:graphic>
               <a:graphicData uri="http://schemas.openxmlformats.org/drawingml/2006/picture">
                 <pic:pic>
                   <pic:nvPicPr>
-                    <pic:cNvPr descr="report_media/media/image2.png" id="28" name="Picture"/>
+                    <pic:cNvPr descr="report_media/media/image2.png" id="34" name="Picture"/>
                     <pic:cNvPicPr>
                       <a:picLocks noChangeArrowheads="1" noChangeAspect="1"/>
                     </pic:cNvPicPr>
                   </pic:nvPicPr>
                   <pic:blipFill>
-                    <a:blip r:embed="rId26"/>
+                    <a:blip r:embed="rId32"/>
                     <a:stretch>
                       <a:fillRect/>
                     </a:stretch>
@@ -2281,7 +2439,7 @@
         <w:pStyle w:val="CaptionCentered"/>
       </w:pPr>
       <w:r>
-        <w:t xml:space="preserve">Figure 2: Share of postings whose text names each skill. Data Analyst is set against Data Scientist/ML Engineer postings.</w:t>
+        <w:t xml:space="preserve">Figure 4: Share of postings whose text names each skill. Data Analyst is set against Data Scientist/ML Engineer postings.</w:t>
       </w:r>
     </w:p>
     <w:p>
@@ -2341,18 +2499,18 @@
           <wp:inline>
             <wp:extent cx="5943600" cy="2552700"/>
             <wp:effectExtent b="0" l="0" r="0" t="0"/>
-            <wp:docPr descr="" title="" id="30" name="Picture"/>
+            <wp:docPr descr="" title="" id="36" name="Picture"/>
             <a:graphic>
               <a:graphicData uri="http://schemas.openxmlformats.org/drawingml/2006/picture">
                 <pic:pic>
                   <pic:nvPicPr>
-                    <pic:cNvPr descr="report_media/media/image3.png" id="31" name="Picture"/>
+                    <pic:cNvPr descr="report_media/media/image3.png" id="37" name="Picture"/>
                     <pic:cNvPicPr>
                       <a:picLocks noChangeArrowheads="1" noChangeAspect="1"/>
                     </pic:cNvPicPr>
                   </pic:nvPicPr>
                   <pic:blipFill>
-                    <a:blip r:embed="rId29"/>
+                    <a:blip r:embed="rId35"/>
                     <a:stretch>
                       <a:fillRect/>
                     </a:stretch>
@@ -2384,7 +2542,7 @@
         <w:pStyle w:val="CaptionCentered"/>
       </w:pPr>
       <w:r>
-        <w:t xml:space="preserve">Figure 3: Team self-ratings for the six skill areas including DS/ML &amp; DA postings that also name each skill.</w:t>
+        <w:t xml:space="preserve">Figure 5: Team self-ratings for the six skill areas including DS/ML &amp; DA postings that also name each skill.</w:t>
       </w:r>
     </w:p>
     <w:tbl>
@@ -3043,7 +3201,7 @@
         <w:t xml:space="preserve"> </w:t>
       </w:r>
       <w:r>
-        <w:t xml:space="preserve">None of our group members are strongest in every skill (Figure 3, Table 4). Machine Learning has the clearest gap</w:t>
+        <w:t xml:space="preserve">None of our group members are strongest in every skill (Figure 5, Table 4). Machine Learning has the clearest gap</w:t>
       </w:r>
       <w:r>
         <w:t xml:space="preserve"> </w:t>
@@ -3313,8 +3471,8 @@
         <w:br w:type="page"/>
       </w:r>
     </w:p>
-    <w:bookmarkEnd w:id="32"/>
-    <w:bookmarkStart w:id="43" w:name="final-analytics"/>
+    <w:bookmarkEnd w:id="38"/>
+    <w:bookmarkStart w:id="55" w:name="final-analytics"/>
     <w:p>
       <w:pPr>
         <w:pStyle w:val="Heading1"/>
@@ -3811,7 +3969,7 @@
         <w:t xml:space="preserve">Table 6: Cross-validated performance of the salary models</w:t>
       </w:r>
     </w:p>
-    <w:bookmarkStart w:id="36" w:name="salary-regression"/>
+    <w:bookmarkStart w:id="42" w:name="salary-regression"/>
     <w:p>
       <w:pPr>
         <w:pStyle w:val="Heading2"/>
@@ -3869,18 +4027,18 @@
           <wp:inline>
             <wp:extent cx="5943600" cy="3162300"/>
             <wp:effectExtent b="0" l="0" r="0" t="0"/>
-            <wp:docPr descr="" title="" id="34" name="Picture"/>
+            <wp:docPr descr="" title="" id="40" name="Picture"/>
             <a:graphic>
               <a:graphicData uri="http://schemas.openxmlformats.org/drawingml/2006/picture">
                 <pic:pic>
                   <pic:nvPicPr>
-                    <pic:cNvPr descr="report_media/media/image4.png" id="35" name="Picture"/>
+                    <pic:cNvPr descr="report_media/media/image4.png" id="41" name="Picture"/>
                     <pic:cNvPicPr>
                       <a:picLocks noChangeArrowheads="1" noChangeAspect="1"/>
                     </pic:cNvPicPr>
                   </pic:nvPicPr>
                   <pic:blipFill>
-                    <a:blip r:embed="rId33"/>
+                    <a:blip r:embed="rId39"/>
                     <a:stretch>
                       <a:fillRect/>
                     </a:stretch>
@@ -3912,7 +4070,7 @@
         <w:pStyle w:val="CaptionCentered"/>
       </w:pPr>
       <w:r>
-        <w:t xml:space="preserve">Figure 4: Ridge regression effects on disclosed pay</w:t>
+        <w:t xml:space="preserve">Figure 6: Ridge regression effects on disclosed pay</w:t>
       </w:r>
     </w:p>
     <w:p>
@@ -3920,7 +4078,7 @@
         <w:pStyle w:val="BodyText"/>
       </w:pPr>
       <w:r>
-        <w:t xml:space="preserve">The results of this mean that role is our strongest factor (Figure 4). ML Engineer titles are associated with approximately $31,000 above</w:t>
+        <w:t xml:space="preserve">The results of this mean that role is our strongest factor (Figure 6). ML Engineer titles are associated with approximately $31,000 above</w:t>
       </w:r>
       <w:r>
         <w:t xml:space="preserve"> </w:t>
@@ -3953,8 +4111,8 @@
         <w:t xml:space="preserve">error of around $38,000, comparing factors and does not predict an individual offer.</w:t>
       </w:r>
     </w:p>
-    <w:bookmarkEnd w:id="36"/>
-    <w:bookmarkStart w:id="37" w:name="role-opportunity-scorecard"/>
+    <w:bookmarkEnd w:id="42"/>
+    <w:bookmarkStart w:id="46" w:name="role-opportunity-scorecard"/>
     <w:p>
       <w:pPr>
         <w:pStyle w:val="Heading2"/>
@@ -4963,101 +5121,168 @@
     </w:p>
     <w:p>
       <w:pPr>
-        <w:pStyle w:val="BodyText"/>
-      </w:pPr>
-      <w:r>
-        <w:t xml:space="preserve">These results tell us that ML Engineer and Data Scientist score highest. Students also face a trade-off based on the scores between ML</w:t>
-      </w:r>
-      <w:r>
-        <w:t xml:space="preserve"> </w:t>
-      </w:r>
-      <w:r>
-        <w:t xml:space="preserve">Engineer paying the most w/ least accessibility, while Data Analyst pays the least but is more accessible. The fit is similar across roles</w:t>
-      </w:r>
-      <w:r>
-        <w:t xml:space="preserve"> </w:t>
-      </w:r>
-      <w:r>
-        <w:t xml:space="preserve">because our rates are fairly even, so pay and accessibility are what is primarily driving the ranking. The roles show steps on one path,</w:t>
-      </w:r>
-      <w:r>
-        <w:t xml:space="preserve"> </w:t>
-      </w:r>
-      <w:r>
-        <w:t xml:space="preserve">which is to start as an analyst, and aim for scientist or ML roles. The ranking is the same under all four weightings (Table 16, Appendix</w:t>
-      </w:r>
-      <w:r>
-        <w:t xml:space="preserve"> </w:t>
-      </w:r>
-      <w:r>
-        <w:t xml:space="preserve">E), so our conclusions do not depend on the weights we chose.</w:t>
-      </w:r>
-    </w:p>
-    <w:bookmarkEnd w:id="37"/>
-    <w:bookmarkStart w:id="41" w:name="salary-estimator"/>
-    <w:p>
-      <w:pPr>
-        <w:pStyle w:val="Heading2"/>
-      </w:pPr>
-      <w:r>
-        <w:t xml:space="preserve">Salary Estimator</w:t>
-      </w:r>
-    </w:p>
-    <w:p>
-      <w:pPr>
-        <w:pStyle w:val="FirstParagraph"/>
-      </w:pPr>
-      <w:r>
-        <w:t xml:space="preserve">The estimator lets a user describe a posting, or their own next step, and see the estimated salary and which single changes are associated</w:t>
-      </w:r>
-      <w:r>
-        <w:t xml:space="preserve"> </w:t>
-      </w:r>
-      <w:r>
-        <w:t xml:space="preserve">with higher pay. Our variables include seven dropdown inputs, years of experience, and checkboxes for the 17 skills.</w:t>
-      </w:r>
-    </w:p>
-    <w:p>
-      <w:pPr>
-        <w:pStyle w:val="BodyText"/>
-      </w:pPr>
-      <w:r>
-        <w:t xml:space="preserve">It is trained on 2,252 salaries from all industries and explains 56% of pay differences with a typical error of about $32,000 (Table 6). It</w:t>
-      </w:r>
-      <w:r>
-        <w:t xml:space="preserve"> </w:t>
-      </w:r>
-      <w:r>
-        <w:t xml:space="preserve">shows a driver only when its 90% range across 150 bootstrap refits excludes zero. It can run in the browser, so nothing a user enters leaves</w:t>
-      </w:r>
-      <w:r>
-        <w:t xml:space="preserve"> </w:t>
-      </w:r>
-      <w:r>
-        <w:t xml:space="preserve">the page. See Appendix G for reference.</w:t>
-      </w:r>
-    </w:p>
-    <w:p>
-      <w:pPr>
         <w:pStyle w:val="ImageCentered"/>
       </w:pPr>
       <w:r>
         <w:drawing>
           <wp:inline>
-            <wp:extent cx="5943600" cy="2311400"/>
+            <wp:extent cx="5943600" cy="3124200"/>
             <wp:effectExtent b="0" l="0" r="0" t="0"/>
-            <wp:docPr descr="" title="" id="39" name="Picture"/>
+            <wp:docPr descr="" title="" id="44" name="Picture"/>
             <a:graphic>
               <a:graphicData uri="http://schemas.openxmlformats.org/drawingml/2006/picture">
                 <pic:pic>
                   <pic:nvPicPr>
-                    <pic:cNvPr descr="report_media/media/image5.png" id="40" name="Picture"/>
+                    <pic:cNvPr descr="report_media/media/image9.png" id="45" name="Picture"/>
                     <pic:cNvPicPr>
                       <a:picLocks noChangeArrowheads="1" noChangeAspect="1"/>
                     </pic:cNvPicPr>
                   </pic:nvPicPr>
                   <pic:blipFill>
-                    <a:blip r:embed="rId38"/>
+                    <a:blip r:embed="rId43"/>
+                    <a:stretch>
+                      <a:fillRect/>
+                    </a:stretch>
+                  </pic:blipFill>
+                  <pic:spPr bwMode="auto">
+                    <a:xfrm>
+                      <a:off x="0" y="0"/>
+                      <a:ext cx="5943600" cy="3124200"/>
+                    </a:xfrm>
+                    <a:prstGeom prst="rect">
+                      <a:avLst/>
+                    </a:prstGeom>
+                    <a:noFill/>
+                    <a:ln w="9525">
+                      <a:noFill/>
+                      <a:headEnd/>
+                      <a:tailEnd/>
+                    </a:ln>
+                  </pic:spPr>
+                </pic:pic>
+              </a:graphicData>
+            </a:graphic>
+          </wp:inline>
+        </w:drawing>
+      </w:r>
+    </w:p>
+    <w:p>
+      <w:pPr>
+        <w:pStyle w:val="CaptionCentered"/>
+      </w:pPr>
+      <w:r>
+        <w:t xml:space="preserve">Figure 7: Opportunity score by role, split into weighted pay, accessibility, and fit (base weights)</w:t>
+      </w:r>
+    </w:p>
+    <w:p>
+      <w:pPr>
+        <w:pStyle w:val="BodyText"/>
+      </w:pPr>
+      <w:r>
+        <w:t xml:space="preserve">These results tell us that ML Engineer and Data Scientist score highest. Students also face a trade-off based on the scores between ML</w:t>
+      </w:r>
+      <w:r>
+        <w:t xml:space="preserve"> </w:t>
+      </w:r>
+      <w:r>
+        <w:t xml:space="preserve">Engineer paying the most w/ least accessibility, while Data Analyst pays the least but is more accessible. Figure 7 shows this trade-off:</w:t>
+      </w:r>
+      <w:r>
+        <w:t xml:space="preserve"> </w:t>
+      </w:r>
+      <w:r>
+        <w:t xml:space="preserve">from ML Engineer down to Data Analyst, the pay part shrinks and the accessibility part grows. The fit is similar across roles because our</w:t>
+      </w:r>
+      <w:r>
+        <w:t xml:space="preserve"> </w:t>
+      </w:r>
+      <w:r>
+        <w:t xml:space="preserve">rates are fairly even, so pay and accessibility are what is primarily driving the ranking. The roles show steps on one path, which is to</w:t>
+      </w:r>
+      <w:r>
+        <w:t xml:space="preserve"> </w:t>
+      </w:r>
+      <w:r>
+        <w:t xml:space="preserve">start as an analyst, and aim for scientist or ML roles. The ranking is the same under all four weightings (Table 16, Appendix E), so our</w:t>
+      </w:r>
+      <w:r>
+        <w:t xml:space="preserve"> </w:t>
+      </w:r>
+      <w:r>
+        <w:t xml:space="preserve">conclusions do not depend on the weights we chose. ML Engineer and Data Scientist are close enough (0.822 and 0.803) that we treat them as</w:t>
+      </w:r>
+      <w:r>
+        <w:t xml:space="preserve"> </w:t>
+      </w:r>
+      <w:r>
+        <w:t xml:space="preserve">roughly tied.</w:t>
+      </w:r>
+    </w:p>
+    <w:bookmarkEnd w:id="46"/>
+    <w:bookmarkStart w:id="50" w:name="salary-estimator"/>
+    <w:p>
+      <w:pPr>
+        <w:pStyle w:val="Heading2"/>
+      </w:pPr>
+      <w:r>
+        <w:t xml:space="preserve">Salary Estimator</w:t>
+      </w:r>
+    </w:p>
+    <w:p>
+      <w:pPr>
+        <w:pStyle w:val="FirstParagraph"/>
+      </w:pPr>
+      <w:r>
+        <w:t xml:space="preserve">The estimator lets a user describe a posting, or their own next step, and see the estimated salary and which single changes are associated</w:t>
+      </w:r>
+      <w:r>
+        <w:t xml:space="preserve"> </w:t>
+      </w:r>
+      <w:r>
+        <w:t xml:space="preserve">with higher pay. Our variables include seven dropdown inputs, years of experience, and checkboxes for the 17 skills.</w:t>
+      </w:r>
+    </w:p>
+    <w:p>
+      <w:pPr>
+        <w:pStyle w:val="BodyText"/>
+      </w:pPr>
+      <w:r>
+        <w:t xml:space="preserve">It is trained on 2,252 salaries from all industries and explains 56% of pay differences with a typical error of about $32,000 (Table 6). It</w:t>
+      </w:r>
+      <w:r>
+        <w:t xml:space="preserve"> </w:t>
+      </w:r>
+      <w:r>
+        <w:t xml:space="preserve">shows a driver only when its 90% range across 150 bootstrap refits excludes zero. It can run in the browser, so nothing a user enters leaves</w:t>
+      </w:r>
+      <w:r>
+        <w:t xml:space="preserve"> </w:t>
+      </w:r>
+      <w:r>
+        <w:t xml:space="preserve">the page. See Appendix G for reference.</w:t>
+      </w:r>
+    </w:p>
+    <w:p>
+      <w:pPr>
+        <w:pStyle w:val="ImageCentered"/>
+      </w:pPr>
+      <w:r>
+        <w:drawing>
+          <wp:inline>
+            <wp:extent cx="5943600" cy="2311400"/>
+            <wp:effectExtent b="0" l="0" r="0" t="0"/>
+            <wp:docPr descr="" title="" id="48" name="Picture"/>
+            <a:graphic>
+              <a:graphicData uri="http://schemas.openxmlformats.org/drawingml/2006/picture">
+                <pic:pic>
+                  <pic:nvPicPr>
+                    <pic:cNvPr descr="report_media/media/image5.png" id="49" name="Picture"/>
+                    <pic:cNvPicPr>
+                      <a:picLocks noChangeArrowheads="1" noChangeAspect="1"/>
+                    </pic:cNvPicPr>
+                  </pic:nvPicPr>
+                  <pic:blipFill>
+                    <a:blip r:embed="rId47"/>
                     <a:stretch>
                       <a:fillRect/>
                     </a:stretch>
@@ -5089,7 +5314,7 @@
         <w:pStyle w:val="CaptionCentered"/>
       </w:pPr>
       <w:r>
-        <w:t xml:space="preserve">Figure 5: Salary estimator output for an entry-level example</w:t>
+        <w:t xml:space="preserve">Figure 8: Salary estimator output for an entry-level example</w:t>
       </w:r>
     </w:p>
     <w:p>
@@ -5097,7 +5322,7 @@
         <w:pStyle w:val="BodyText"/>
       </w:pPr>
       <w:r>
-        <w:t xml:space="preserve">For the entry-level example in Figure 5, the estimate is $97,523. The largest gains come from changing roles (+$54,000 to Data Scientist,</w:t>
+        <w:t xml:space="preserve">For the entry-level example in Figure 8, the estimate is $97,523. The largest gains come from changing roles (+$54,000 to Data Scientist,</w:t>
       </w:r>
       <w:r>
         <w:t xml:space="preserve"> </w:t>
@@ -5124,8 +5349,8 @@
         <w:t xml:space="preserve">its range (-$4,200 to +$7,300) includes zero.</w:t>
       </w:r>
     </w:p>
-    <w:bookmarkEnd w:id="41"/>
-    <w:bookmarkStart w:id="42" w:name="benchmark-against-the-whole-market"/>
+    <w:bookmarkEnd w:id="50"/>
+    <w:bookmarkStart w:id="54" w:name="benchmark-against-the-whole-market"/>
     <w:p>
       <w:pPr>
         <w:pStyle w:val="Heading2"/>
@@ -5167,13 +5392,94 @@
       </w:r>
     </w:p>
     <w:p>
+      <w:pPr>
+        <w:pStyle w:val="ImageCentered"/>
+      </w:pPr>
+      <w:r>
+        <w:drawing>
+          <wp:inline>
+            <wp:extent cx="5943600" cy="3454400"/>
+            <wp:effectExtent b="0" l="0" r="0" t="0"/>
+            <wp:docPr descr="" title="" id="52" name="Picture"/>
+            <a:graphic>
+              <a:graphicData uri="http://schemas.openxmlformats.org/drawingml/2006/picture">
+                <pic:pic>
+                  <pic:nvPicPr>
+                    <pic:cNvPr descr="report_media/media/image10.png" id="53" name="Picture"/>
+                    <pic:cNvPicPr>
+                      <a:picLocks noChangeArrowheads="1" noChangeAspect="1"/>
+                    </pic:cNvPicPr>
+                  </pic:nvPicPr>
+                  <pic:blipFill>
+                    <a:blip r:embed="rId51"/>
+                    <a:stretch>
+                      <a:fillRect/>
+                    </a:stretch>
+                  </pic:blipFill>
+                  <pic:spPr bwMode="auto">
+                    <a:xfrm>
+                      <a:off x="0" y="0"/>
+                      <a:ext cx="5943600" cy="3454400"/>
+                    </a:xfrm>
+                    <a:prstGeom prst="rect">
+                      <a:avLst/>
+                    </a:prstGeom>
+                    <a:noFill/>
+                    <a:ln w="9525">
+                      <a:noFill/>
+                      <a:headEnd/>
+                      <a:tailEnd/>
+                    </a:ln>
+                  </pic:spPr>
+                </pic:pic>
+              </a:graphicData>
+            </a:graphic>
+          </wp:inline>
+        </w:drawing>
+      </w:r>
+    </w:p>
+    <w:p>
+      <w:pPr>
+        <w:pStyle w:val="CaptionCentered"/>
+      </w:pPr>
+      <w:r>
+        <w:t xml:space="preserve">Figure 9: Median salary by occupation field, all industries (69,246 postings with a usable salary)</w:t>
+      </w:r>
+    </w:p>
+    <w:p>
+      <w:pPr>
+        <w:pStyle w:val="BodyText"/>
+      </w:pPr>
+      <w:r>
+        <w:t xml:space="preserve">In Figure 9, the diamonds mark the median of AI-related postings in each field. They sit well above the field median in Software</w:t>
+      </w:r>
+      <w:r>
+        <w:t xml:space="preserve"> </w:t>
+      </w:r>
+      <w:r>
+        <w:t xml:space="preserve">Engineering ($200,000), Cybersecurity ($180,000), and Product &amp; Project Management ($182,500), while in Data Science &amp; ML, 91% of</w:t>
+      </w:r>
+      <w:r>
+        <w:t xml:space="preserve"> </w:t>
+      </w:r>
+      <w:r>
+        <w:t xml:space="preserve">postings are already AI-related, so the two match. For our pathway, AI-related Data Analytics &amp; BI postings have a median of $136,250</w:t>
+      </w:r>
+      <w:r>
+        <w:t xml:space="preserve"> </w:t>
+      </w:r>
+      <w:r>
+        <w:t xml:space="preserve">against $117,750 for other analyst postings, though this rests on only 78 postings.</w:t>
+      </w:r>
+    </w:p>
+    <w:p>
       <w:r>
         <w:br w:type="page"/>
       </w:r>
     </w:p>
-    <w:bookmarkEnd w:id="42"/>
-    <w:bookmarkEnd w:id="43"/>
-    <w:bookmarkStart w:id="44" w:name="recommendations"/>
+    <w:bookmarkEnd w:id="54"/>
+    <w:bookmarkEnd w:id="55"/>
+    <w:bookmarkStart w:id="56" w:name="recommendations"/>
     <w:p>
       <w:pPr>
         <w:pStyle w:val="Heading1"/>
@@ -5265,25 +5571,25 @@
         </w:numPr>
       </w:pPr>
       <w:r>
-        <w:t xml:space="preserve">Build documented experience early. Only about 17% of postings with a stated requirement ask for two years or fewer, which matches</w:t>
-      </w:r>
-      <w:r>
-        <w:t xml:space="preserve"> </w:t>
-      </w:r>
-      <w:r>
-        <w:t xml:space="preserve">research showing that employment of young workers in AI-exposed jobs has fallen behind their peers (Brynjolfsson et al., 2026). The</w:t>
-      </w:r>
-      <w:r>
-        <w:t xml:space="preserve"> </w:t>
-      </w:r>
-      <w:r>
-        <w:t xml:space="preserve">median posting asks for five years, and each additional year requested is associated with about $5,500 more. Internships, research, and</w:t>
-      </w:r>
-      <w:r>
-        <w:t xml:space="preserve"> </w:t>
-      </w:r>
-      <w:r>
-        <w:t xml:space="preserve">projects count most when they are documented in a portfolio.</w:t>
+        <w:t xml:space="preserve">Build documented experience early. Only about 17% of postings with a stated requirement ask for two years or fewer (Figure 3), which</w:t>
+      </w:r>
+      <w:r>
+        <w:t xml:space="preserve"> </w:t>
+      </w:r>
+      <w:r>
+        <w:t xml:space="preserve">matches research showing that employment of young workers in AI-exposed jobs has fallen behind their peers (Brynjolfsson et al., 2026).</w:t>
+      </w:r>
+      <w:r>
+        <w:t xml:space="preserve"> </w:t>
+      </w:r>
+      <w:r>
+        <w:t xml:space="preserve">The median posting asks for five years, and each additional year requested is associated with about $5,500 more. Internships, research,</w:t>
+      </w:r>
+      <w:r>
+        <w:t xml:space="preserve"> </w:t>
+      </w:r>
+      <w:r>
+        <w:t xml:space="preserve">and projects count most when they are documented in a portfolio.</w:t>
       </w:r>
     </w:p>
     <w:p>
@@ -5294,13 +5600,13 @@
         </w:numPr>
       </w:pPr>
       <w:r>
-        <w:t xml:space="preserve">Choose locations deliberately. California and New York offer the most postings and the highest disclosed pay; Virginia, the District of</w:t>
-      </w:r>
-      <w:r>
-        <w:t xml:space="preserve"> </w:t>
-      </w:r>
-      <w:r>
-        <w:t xml:space="preserve">Columbia, and Maryland offer federal-contractor roles at lower pay. Only 10% of postings say they are remote.</w:t>
+        <w:t xml:space="preserve">Choose locations deliberately. California and New York offer the most postings and the highest disclosed pay (Figure 2); Virginia, the</w:t>
+      </w:r>
+      <w:r>
+        <w:t xml:space="preserve"> </w:t>
+      </w:r>
+      <w:r>
+        <w:t xml:space="preserve">District of Columbia, and Maryland offer federal-contractor roles at lower pay. Only 10% of postings say they are remote.</w:t>
       </w:r>
     </w:p>
     <w:p>
@@ -5334,8 +5640,8 @@
         <w:t xml:space="preserve">scripts can refresh the product with each new release of the job files.</w:t>
       </w:r>
     </w:p>
-    <w:bookmarkEnd w:id="44"/>
-    <w:bookmarkStart w:id="45" w:name="limitations"/>
+    <w:bookmarkEnd w:id="56"/>
+    <w:bookmarkStart w:id="57" w:name="limitations"/>
     <w:p>
       <w:pPr>
         <w:pStyle w:val="Heading1"/>
@@ -5436,8 +5742,8 @@
         <w:t xml:space="preserve">of the skill patterns on a sample of postings, and an input that lets each user enter their own skill ratings.</w:t>
       </w:r>
     </w:p>
-    <w:bookmarkEnd w:id="45"/>
-    <w:bookmarkStart w:id="46" w:name="conclusion"/>
+    <w:bookmarkEnd w:id="57"/>
+    <w:bookmarkStart w:id="58" w:name="conclusion"/>
     <w:p>
       <w:pPr>
         <w:pStyle w:val="Heading1"/>
@@ -5879,8 +6185,8 @@
         <w:br w:type="page"/>
       </w:r>
     </w:p>
-    <w:bookmarkEnd w:id="46"/>
-    <w:bookmarkStart w:id="47" w:name="references"/>
+    <w:bookmarkEnd w:id="58"/>
+    <w:bookmarkStart w:id="59" w:name="references"/>
     <w:p>
       <w:pPr>
         <w:pStyle w:val="Heading1"/>
@@ -6203,8 +6509,8 @@
         <w:br w:type="page"/>
       </w:r>
     </w:p>
-    <w:bookmarkEnd w:id="47"/>
-    <w:bookmarkStart w:id="48" w:name="appendix-a---team-contributions"/>
+    <w:bookmarkEnd w:id="59"/>
+    <w:bookmarkStart w:id="60" w:name="appendix-a---team-contributions"/>
     <w:p>
       <w:pPr>
         <w:pStyle w:val="Heading1"/>
@@ -6369,8 +6675,8 @@
         <w:t xml:space="preserve">Table 10: Team Contributions</w:t>
       </w:r>
     </w:p>
-    <w:bookmarkEnd w:id="48"/>
-    <w:bookmarkStart w:id="49" w:name="appendix-b---data-dictionary"/>
+    <w:bookmarkEnd w:id="60"/>
+    <w:bookmarkStart w:id="61" w:name="appendix-b---data-dictionary"/>
     <w:p>
       <w:pPr>
         <w:pStyle w:val="Heading1"/>
@@ -6878,8 +7184,8 @@
         <w:t xml:space="preserve">Table 11: Variables in main analytical file</w:t>
       </w:r>
     </w:p>
-    <w:bookmarkEnd w:id="49"/>
-    <w:bookmarkStart w:id="50" w:name="appendix-c---classification-rules"/>
+    <w:bookmarkEnd w:id="61"/>
+    <w:bookmarkStart w:id="62" w:name="appendix-c---classification-rules"/>
     <w:p>
       <w:pPr>
         <w:pStyle w:val="Heading1"/>
@@ -7557,8 +7863,8 @@
         <w:t xml:space="preserve">PyTorch, or TensorFlow.</w:t>
       </w:r>
     </w:p>
-    <w:bookmarkEnd w:id="50"/>
-    <w:bookmarkStart w:id="51" w:name="Xfdb8dacae744e3f9cb3a8e59a9eb5f0337fccf4"/>
+    <w:bookmarkEnd w:id="62"/>
+    <w:bookmarkStart w:id="63" w:name="Xfdb8dacae744e3f9cb3a8e59a9eb5f0337fccf4"/>
     <w:p>
       <w:pPr>
         <w:pStyle w:val="Heading1"/>
@@ -8798,8 +9104,8 @@
         <w:br w:type="page"/>
       </w:r>
     </w:p>
-    <w:bookmarkEnd w:id="51"/>
-    <w:bookmarkStart w:id="52" w:name="Xbac23316b27c10b5ed3e71dd8a690f822dd0b84"/>
+    <w:bookmarkEnd w:id="63"/>
+    <w:bookmarkStart w:id="64" w:name="Xbac23316b27c10b5ed3e71dd8a690f822dd0b84"/>
     <w:p>
       <w:pPr>
         <w:pStyle w:val="Heading1"/>
@@ -9570,8 +9876,8 @@
         <w:t xml:space="preserve">the top two as tied and present Data Analyst as the entry point.</w:t>
       </w:r>
     </w:p>
-    <w:bookmarkEnd w:id="52"/>
-    <w:bookmarkStart w:id="53" w:name="appendix-f---reproducibility"/>
+    <w:bookmarkEnd w:id="64"/>
+    <w:bookmarkStart w:id="65" w:name="appendix-f---reproducibility"/>
     <w:p>
       <w:pPr>
         <w:pStyle w:val="Heading1"/>
@@ -9896,8 +10202,8 @@
         <w:t xml:space="preserve">Table 17: Commands that rebuild our product</w:t>
       </w:r>
     </w:p>
-    <w:bookmarkEnd w:id="53"/>
-    <w:bookmarkStart w:id="57" w:name="appendix-g---product-website"/>
+    <w:bookmarkEnd w:id="65"/>
+    <w:bookmarkStart w:id="69" w:name="appendix-g---product-website"/>
     <w:p>
       <w:pPr>
         <w:pStyle w:val="Heading1"/>
@@ -10416,18 +10722,18 @@
           <wp:inline>
             <wp:extent cx="4838700" cy="4848225"/>
             <wp:effectExtent b="0" l="0" r="0" t="0"/>
-            <wp:docPr descr="" title="" id="55" name="Picture"/>
+            <wp:docPr descr="" title="" id="67" name="Picture"/>
             <a:graphic>
               <a:graphicData uri="http://schemas.openxmlformats.org/drawingml/2006/picture">
                 <pic:pic>
                   <pic:nvPicPr>
-                    <pic:cNvPr descr="report_media/media/image6.png" id="56" name="Picture"/>
+                    <pic:cNvPr descr="report_media/media/image6.png" id="68" name="Picture"/>
                     <pic:cNvPicPr>
                       <a:picLocks noChangeArrowheads="1" noChangeAspect="1"/>
                     </pic:cNvPicPr>
                   </pic:nvPicPr>
                   <pic:blipFill>
-                    <a:blip r:embed="rId54"/>
+                    <a:blip r:embed="rId66"/>
                     <a:stretch>
                       <a:fillRect/>
                     </a:stretch>
@@ -10459,10 +10765,143 @@
         <w:pStyle w:val="CaptionCentered"/>
       </w:pPr>
       <w:r>
-        <w:t xml:space="preserve">Figure 6: Salary estimator inputs on the Predictive Modeling page, set to the example profile.</w:t>
-      </w:r>
-    </w:p>
-    <w:bookmarkEnd w:id="57"/>
+        <w:t xml:space="preserve">Figure 10: Salary estimator inputs on the Predictive Modeling page, set to the example profile.</w:t>
+      </w:r>
+    </w:p>
+    <w:p>
+      <w:r>
+        <w:br w:type="page"/>
+      </w:r>
+    </w:p>
+    <w:bookmarkEnd w:id="69"/>
+    <w:bookmarkStart w:id="70" w:name="ai-use-disclosure"/>
+    <w:p>
+      <w:pPr>
+        <w:pStyle w:val="Heading1"/>
+      </w:pPr>
+      <w:r>
+        <w:t xml:space="preserve">AI Use Disclosure</w:t>
+      </w:r>
+    </w:p>
+    <w:p>
+      <w:pPr>
+        <w:pStyle w:val="FirstParagraph"/>
+      </w:pPr>
+      <w:r>
+        <w:t xml:space="preserve">Our team used variations of Artificial Intelligence support tools during this project in the following ways:</w:t>
+      </w:r>
+    </w:p>
+    <w:p>
+      <w:pPr>
+        <w:numPr>
+          <w:ilvl w:val="0"/>
+          <w:numId w:val="1006"/>
+        </w:numPr>
+      </w:pPr>
+      <w:r>
+        <w:rPr>
+          <w:b/>
+          <w:bCs/>
+        </w:rPr>
+        <w:t xml:space="preserve">Code assistance:</w:t>
+      </w:r>
+      <w:r>
+        <w:t xml:space="preserve"> </w:t>
+      </w:r>
+      <w:r>
+        <w:t xml:space="preserve">drafting and debugging Python code for data preparation, the salary models, and the interactive website charts.</w:t>
+      </w:r>
+    </w:p>
+    <w:p>
+      <w:pPr>
+        <w:numPr>
+          <w:ilvl w:val="0"/>
+          <w:numId w:val="1006"/>
+        </w:numPr>
+      </w:pPr>
+      <w:r>
+        <w:rPr>
+          <w:b/>
+          <w:bCs/>
+        </w:rPr>
+        <w:t xml:space="preserve">Writing support:</w:t>
+      </w:r>
+      <w:r>
+        <w:t xml:space="preserve"> </w:t>
+      </w:r>
+      <w:r>
+        <w:t xml:space="preserve">suggesting edits for clarity, structure, and length to sections our team drafted.</w:t>
+      </w:r>
+    </w:p>
+    <w:p>
+      <w:pPr>
+        <w:numPr>
+          <w:ilvl w:val="0"/>
+          <w:numId w:val="1006"/>
+        </w:numPr>
+      </w:pPr>
+      <w:r>
+        <w:rPr>
+          <w:b/>
+          <w:bCs/>
+        </w:rPr>
+        <w:t xml:space="preserve">Sources and formatting:</w:t>
+      </w:r>
+      <w:r>
+        <w:t xml:space="preserve"> </w:t>
+      </w:r>
+      <w:r>
+        <w:t xml:space="preserve">helping locate recent research, checking that cited sources exist and support our statements, and formatting</w:t>
+      </w:r>
+      <w:r>
+        <w:t xml:space="preserve"> </w:t>
+      </w:r>
+      <w:r>
+        <w:t xml:space="preserve">references in APA.</w:t>
+      </w:r>
+    </w:p>
+    <w:p>
+      <w:pPr>
+        <w:numPr>
+          <w:ilvl w:val="0"/>
+          <w:numId w:val="1006"/>
+        </w:numPr>
+      </w:pPr>
+      <w:r>
+        <w:rPr>
+          <w:b/>
+          <w:bCs/>
+        </w:rPr>
+        <w:t xml:space="preserve">Review:</w:t>
+      </w:r>
+      <w:r>
+        <w:t xml:space="preserve"> </w:t>
+      </w:r>
+      <w:r>
+        <w:t xml:space="preserve">flagging inconsistencies in drafts between this report, website, and research studies.</w:t>
+      </w:r>
+    </w:p>
+    <w:p>
+      <w:pPr>
+        <w:pStyle w:val="FirstParagraph"/>
+      </w:pPr>
+      <w:r>
+        <w:t xml:space="preserve">All data come from the course’s MET Career Compass job files, and every statistic, table, and figure in this report was produced by code run</w:t>
+      </w:r>
+      <w:r>
+        <w:t xml:space="preserve"> </w:t>
+      </w:r>
+      <w:r>
+        <w:t xml:space="preserve">on that data. Team members reviewed all AI-suggested code and text, checked reported numbers against our outputs, and made every decision</w:t>
+      </w:r>
+      <w:r>
+        <w:t xml:space="preserve"> </w:t>
+      </w:r>
+      <w:r>
+        <w:t xml:space="preserve">about scope, methods, interpretation, and recommendations. The team takes full responsibility for the content of this report.</w:t>
+      </w:r>
+    </w:p>
+    <w:bookmarkEnd w:id="70"/>
     <w:sectPr>
       <w:footerReference r:id="rId9" w:type="default"/>
       <w:footnotePr>
@@ -10908,6 +11347,9 @@
     <w:lvlOverride w:ilvl="8">
       <w:startOverride w:val="1"/>
     </w:lvlOverride>
+  </w:num>
+  <w:num w:numId="1006">
+    <w:abstractNumId w:val="991"/>
   </w:num>
 </w:numbering>
 </file>

</xml_diff>